<commit_message>
Implement Redis caching in JWT authentication
</commit_message>
<xml_diff>
--- a/DOCUMENT/4_Chapter1_Introduction_ProjectProfile.docx
+++ b/DOCUMENT/4_Chapter1_Introduction_ProjectProfile.docx
@@ -852,7 +852,21 @@
                 <w:rFonts w:asciiTheme="majorHAnsi" w:hAnsiTheme="majorHAnsi" w:cstheme="majorHAnsi"/>
                 <w:sz w:val="24"/>
               </w:rPr>
-              <w:t>MCA Semester – III  (2025 – 2027)</w:t>
+              <w:t xml:space="preserve">MCA Semester – </w:t>
+            </w:r>
+            <w:r>
+              <w:rPr>
+                <w:rFonts w:asciiTheme="majorHAnsi" w:hAnsiTheme="majorHAnsi" w:cstheme="majorHAnsi"/>
+                <w:sz w:val="24"/>
+              </w:rPr>
+              <w:t>III (</w:t>
+            </w:r>
+            <w:r>
+              <w:rPr>
+                <w:rFonts w:asciiTheme="majorHAnsi" w:hAnsiTheme="majorHAnsi" w:cstheme="majorHAnsi"/>
+                <w:sz w:val="24"/>
+              </w:rPr>
+              <w:t>2025 – 2027)</w:t>
             </w:r>
           </w:p>
         </w:tc>
@@ -963,7 +977,15 @@
                 <w:b/>
                 <w:sz w:val="24"/>
               </w:rPr>
-              <w:t>Project Co-ordinator</w:t>
+              <w:t>Project Co-</w:t>
+            </w:r>
+            <w:r>
+              <w:rPr>
+                <w:rFonts w:asciiTheme="majorHAnsi" w:hAnsiTheme="majorHAnsi" w:cstheme="majorHAnsi"/>
+                <w:b/>
+                <w:sz w:val="24"/>
+              </w:rPr>
+              <w:t>Ordinator</w:t>
             </w:r>
           </w:p>
         </w:tc>
@@ -1174,7 +1196,16 @@
           <w:color w:val="B91C1C"/>
           <w:sz w:val="28"/>
         </w:rPr>
-        <w:t>1.2  About the Project</w:t>
+        <w:t>1.2 About</w:t>
+      </w:r>
+      <w:r>
+        <w:rPr>
+          <w:rFonts w:asciiTheme="majorHAnsi" w:hAnsiTheme="majorHAnsi" w:cstheme="majorHAnsi"/>
+          <w:b/>
+          <w:color w:val="B91C1C"/>
+          <w:sz w:val="28"/>
+        </w:rPr>
+        <w:t xml:space="preserve"> the Project</w:t>
       </w:r>
     </w:p>
     <w:p>
@@ -1246,7 +1277,7 @@
           <w:color w:val="B91C1C"/>
           <w:sz w:val="28"/>
         </w:rPr>
-        <w:t>1.3  Objectives</w:t>
+        <w:t>1.3 Objectives</w:t>
       </w:r>
     </w:p>
     <w:p>

</xml_diff>